<commit_message>
﻿Plegado: Temperatura de ensayo va al final (despues de Zona de plegado)
</commit_message>
<xml_diff>
--- a/server/templates/plegado.docx
+++ b/server/templates/plegado.docx
@@ -5,14 +5,16 @@
     <w:p>
       <w:pPr>
         <w:pStyle w:val="Textosinformato"/>
+        <w:spacing w:line="276" w:lineRule="auto"/>
         <w:jc w:val="center"/>
         <w:rPr>
           <w:rFonts w:ascii="Calibri" w:eastAsia="MS Mincho" w:hAnsi="Calibri"/>
           <w:sz w:val="22"/>
           <w:szCs w:val="22"/>
         </w:rPr>
-        <w:spacing w:line="276" w:lineRule="auto" w:after="0"/>
-      </w:pPr>
+      </w:pPr>
+      <w:bookmarkStart w:id="0" w:name="_GoBack"/>
+      <w:bookmarkEnd w:id="0"/>
       <w:r>
         <w:rPr>
           <w:rFonts w:ascii="Calibri" w:eastAsia="MS Mincho" w:hAnsi="Calibri"/>
@@ -49,6 +51,7 @@
     <w:p>
       <w:pPr>
         <w:pStyle w:val="Textosinformato"/>
+        <w:spacing w:line="276" w:lineRule="auto"/>
         <w:jc w:val="center"/>
         <w:rPr>
           <w:rFonts w:ascii="Calibri" w:eastAsia="MS Mincho" w:hAnsi="Calibri"/>
@@ -57,7 +60,6 @@
           <w:sz w:val="22"/>
           <w:szCs w:val="22"/>
         </w:rPr>
-        <w:spacing w:line="276" w:lineRule="auto" w:after="0"/>
       </w:pPr>
       <w:r>
         <w:rPr>
@@ -73,6 +75,7 @@
     <w:p>
       <w:pPr>
         <w:pStyle w:val="Textosinformato"/>
+        <w:spacing w:line="276" w:lineRule="auto"/>
         <w:jc w:val="center"/>
         <w:rPr>
           <w:rFonts w:ascii="Calibri" w:eastAsia="MS Mincho" w:hAnsi="Calibri"/>
@@ -81,13 +84,12 @@
           <w:sz w:val="22"/>
           <w:szCs w:val="22"/>
         </w:rPr>
-        <w:spacing w:line="276" w:lineRule="auto" w:after="0"/>
       </w:pPr>
     </w:p>
     <w:p>
       <w:pPr>
         <w:pStyle w:val="Textosinformato"/>
-        <w:spacing w:line="276" w:lineRule="auto" w:after="0"/>
+        <w:spacing w:line="276" w:lineRule="auto"/>
         <w:jc w:val="center"/>
         <w:rPr>
           <w:rFonts w:ascii="Calibri" w:eastAsia="MS Mincho" w:hAnsi="Calibri"/>
@@ -95,7 +97,7 @@
           <w:szCs w:val="22"/>
         </w:rPr>
       </w:pPr>
-      <w:bookmarkStart w:id="0" w:name="_Hlk145324453"/>
+      <w:bookmarkStart w:id="1" w:name="_Hlk145324453"/>
       <w:r>
         <w:rPr>
           <w:rFonts w:ascii="Calibri" w:eastAsia="MS Mincho" w:hAnsi="Calibri"/>
@@ -108,7 +110,7 @@
     <w:p>
       <w:pPr>
         <w:pStyle w:val="Textosinformato"/>
-        <w:spacing w:line="276" w:lineRule="auto" w:after="0"/>
+        <w:spacing w:line="276" w:lineRule="auto"/>
         <w:jc w:val="center"/>
         <w:rPr>
           <w:rFonts w:ascii="Calibri" w:eastAsia="MS Mincho" w:hAnsi="Calibri"/>
@@ -128,7 +130,7 @@
     <w:p>
       <w:pPr>
         <w:pStyle w:val="Textosinformato"/>
-        <w:spacing w:line="276" w:lineRule="auto" w:after="0"/>
+        <w:spacing w:line="276" w:lineRule="auto"/>
         <w:jc w:val="center"/>
         <w:rPr>
           <w:rFonts w:ascii="Calibri" w:eastAsia="MS Mincho" w:hAnsi="Calibri"/>
@@ -144,22 +146,23 @@
         </w:rPr>
         <w:t>Fecha de finalización del certificado: {{fecha_finalizacion_certificado}}</w:t>
       </w:r>
-      <w:bookmarkEnd w:id="0"/>
+      <w:bookmarkEnd w:id="1"/>
     </w:p>
     <w:p>
       <w:pPr>
         <w:pStyle w:val="Textosinformato"/>
+        <w:spacing w:line="276" w:lineRule="auto"/>
         <w:rPr>
           <w:rFonts w:eastAsia="MS Mincho"/>
           <w:sz w:val="22"/>
           <w:szCs w:val="22"/>
         </w:rPr>
-        <w:spacing w:line="276" w:lineRule="auto" w:after="0"/>
       </w:pPr>
     </w:p>
     <w:p>
       <w:pPr>
         <w:pStyle w:val="Textosinformato"/>
+        <w:spacing w:line="276" w:lineRule="auto"/>
         <w:jc w:val="center"/>
         <w:rPr>
           <w:rFonts w:ascii="Calibri" w:eastAsia="MS Mincho" w:hAnsi="Calibri"/>
@@ -168,7 +171,6 @@
           <w:szCs w:val="22"/>
           <w:u w:val="single"/>
         </w:rPr>
-        <w:spacing w:line="276" w:lineRule="auto" w:after="0"/>
       </w:pPr>
       <w:r>
         <w:rPr>
@@ -182,6 +184,7 @@
     <w:p>
       <w:pPr>
         <w:pStyle w:val="Textosinformato"/>
+        <w:spacing w:line="276" w:lineRule="auto"/>
         <w:jc w:val="center"/>
         <w:rPr>
           <w:rFonts w:ascii="Calibri" w:eastAsia="MS Mincho" w:hAnsi="Calibri"/>
@@ -189,7 +192,6 @@
           <w:sz w:val="22"/>
           <w:szCs w:val="22"/>
         </w:rPr>
-        <w:spacing w:line="276" w:lineRule="auto" w:after="0"/>
       </w:pPr>
       <w:r>
         <w:rPr>
@@ -259,24 +261,24 @@
     <w:p>
       <w:pPr>
         <w:pStyle w:val="Textosinformato"/>
+        <w:spacing w:line="276" w:lineRule="auto"/>
         <w:rPr>
           <w:rFonts w:eastAsia="MS Mincho"/>
           <w:sz w:val="22"/>
           <w:szCs w:val="22"/>
         </w:rPr>
-        <w:spacing w:line="276" w:lineRule="auto" w:after="0"/>
       </w:pPr>
     </w:p>
     <w:p>
       <w:pPr>
         <w:pStyle w:val="Textosinformato"/>
+        <w:spacing w:line="276" w:lineRule="auto"/>
         <w:rPr>
           <w:rFonts w:eastAsia="MS Mincho"/>
           <w:b/>
           <w:sz w:val="22"/>
           <w:szCs w:val="22"/>
         </w:rPr>
-        <w:spacing w:line="276" w:lineRule="auto" w:after="0"/>
       </w:pPr>
     </w:p>
     <w:p>
@@ -289,7 +291,7 @@
         <w:tabs>
           <w:tab w:val="left" w:pos="426"/>
         </w:tabs>
-        <w:spacing w:line="276" w:lineRule="auto" w:after="0"/>
+        <w:spacing w:line="276" w:lineRule="auto"/>
         <w:ind w:hanging="218"/>
         <w:rPr>
           <w:rFonts w:ascii="Calibri" w:eastAsia="MS Mincho" w:hAnsi="Calibri"/>
@@ -331,7 +333,7 @@
           <w:tab w:val="left" w:pos="709"/>
           <w:tab w:val="left" w:pos="851"/>
         </w:tabs>
-        <w:spacing w:line="276" w:lineRule="auto" w:after="0"/>
+        <w:spacing w:line="276" w:lineRule="auto"/>
         <w:rPr>
           <w:rFonts w:ascii="Calibri" w:eastAsia="MS Mincho" w:hAnsi="Calibri"/>
           <w:b/>
@@ -352,7 +354,7 @@
     <w:p>
       <w:pPr>
         <w:pStyle w:val="Textosinformato"/>
-        <w:spacing w:line="276" w:lineRule="auto" w:after="0"/>
+        <w:spacing w:line="276" w:lineRule="auto"/>
         <w:ind w:left="792"/>
         <w:rPr>
           <w:rFonts w:ascii="Calibri" w:eastAsia="MS Mincho" w:hAnsi="Calibri"/>
@@ -372,7 +374,7 @@
     <w:p>
       <w:pPr>
         <w:pStyle w:val="Textosinformato"/>
-        <w:spacing w:line="276" w:lineRule="auto" w:after="0"/>
+        <w:spacing w:line="276" w:lineRule="auto"/>
         <w:ind w:left="792"/>
         <w:rPr>
           <w:rFonts w:ascii="Calibri" w:eastAsia="MS Mincho" w:hAnsi="Calibri"/>
@@ -392,7 +394,7 @@
     <w:p>
       <w:pPr>
         <w:pStyle w:val="Textosinformato"/>
-        <w:spacing w:line="276" w:lineRule="auto" w:after="0"/>
+        <w:spacing w:line="276" w:lineRule="auto"/>
         <w:ind w:left="792"/>
         <w:rPr>
           <w:rFonts w:ascii="Calibri" w:eastAsia="MS Mincho" w:hAnsi="Calibri"/>
@@ -412,7 +414,7 @@
     <w:p>
       <w:pPr>
         <w:pStyle w:val="Textosinformato"/>
-        <w:spacing w:line="276" w:lineRule="auto" w:after="0"/>
+        <w:spacing w:line="276" w:lineRule="auto"/>
         <w:ind w:left="792"/>
         <w:rPr>
           <w:rFonts w:ascii="Calibri" w:eastAsia="MS Mincho" w:hAnsi="Calibri" w:cs="Calibri"/>
@@ -440,7 +442,7 @@
     <w:p>
       <w:pPr>
         <w:pStyle w:val="Textosinformato"/>
-        <w:spacing w:line="276" w:lineRule="auto" w:after="0"/>
+        <w:spacing w:line="276" w:lineRule="auto"/>
         <w:ind w:left="792"/>
         <w:rPr>
           <w:rFonts w:ascii="Calibri" w:eastAsia="MS Mincho" w:hAnsi="Calibri" w:cs="Calibri"/>
@@ -460,7 +462,7 @@
     <w:p>
       <w:pPr>
         <w:pStyle w:val="Textosinformato"/>
-        <w:spacing w:line="276" w:lineRule="auto" w:after="0"/>
+        <w:spacing w:line="276" w:lineRule="auto"/>
         <w:ind w:left="792"/>
         <w:rPr>
           <w:rFonts w:ascii="Calibri" w:eastAsia="MS Mincho" w:hAnsi="Calibri" w:cs="Calibri"/>
@@ -480,7 +482,7 @@
     <w:p>
       <w:pPr>
         <w:pStyle w:val="Textosinformato"/>
-        <w:spacing w:line="276" w:lineRule="auto" w:after="0"/>
+        <w:spacing w:line="276" w:lineRule="auto"/>
         <w:ind w:left="792"/>
         <w:rPr>
           <w:rFonts w:ascii="Calibri" w:eastAsia="MS Mincho" w:hAnsi="Calibri" w:cs="Calibri"/>
@@ -500,7 +502,7 @@
     <w:p>
       <w:pPr>
         <w:pStyle w:val="Textosinformato"/>
-        <w:spacing w:line="276" w:lineRule="auto" w:after="0"/>
+        <w:spacing w:line="276" w:lineRule="auto"/>
         <w:ind w:left="792"/>
         <w:rPr>
           <w:rFonts w:ascii="Calibri" w:eastAsia="MS Mincho" w:hAnsi="Calibri" w:cs="Calibri"/>
@@ -520,7 +522,7 @@
     <w:p>
       <w:pPr>
         <w:pStyle w:val="Textosinformato"/>
-        <w:spacing w:line="276" w:lineRule="auto" w:after="0"/>
+        <w:spacing w:line="276" w:lineRule="auto"/>
         <w:ind w:left="792"/>
         <w:rPr>
           <w:rFonts w:ascii="Calibri" w:eastAsia="MS Mincho" w:hAnsi="Calibri" w:cs="Calibri"/>
@@ -540,7 +542,7 @@
     <w:p>
       <w:pPr>
         <w:pStyle w:val="Textosinformato"/>
-        <w:spacing w:line="276" w:lineRule="auto" w:after="0"/>
+        <w:spacing w:line="276" w:lineRule="auto"/>
         <w:ind w:left="792"/>
         <w:rPr>
           <w:rFonts w:ascii="Calibri" w:eastAsia="MS Mincho" w:hAnsi="Calibri" w:cs="Calibri"/>
@@ -550,31 +552,32 @@
       </w:pPr>
       <w:r>
         <w:rPr>
+          <w:rFonts w:ascii="Calibri" w:hAnsi="Calibri" w:cs="Calibri"/>
+          <w:sz w:val="22"/>
+          <w:szCs w:val="22"/>
+        </w:rPr>
+        <w:t>{{zona_plegado_linea}}</w:t>
+      </w:r>
+    </w:p>
+    <w:p/>
+    <w:p>
+      <w:pPr>
+        <w:pStyle w:val="Textosinformato"/>
+        <w:spacing w:line="276" w:lineRule="auto"/>
+        <w:ind w:left="792"/>
+        <w:rPr>
           <w:rFonts w:ascii="Calibri" w:eastAsia="MS Mincho" w:hAnsi="Calibri" w:cs="Calibri"/>
           <w:sz w:val="22"/>
           <w:szCs w:val="22"/>
         </w:rPr>
+      </w:pPr>
+      <w:r>
+        <w:rPr>
+          <w:rFonts w:ascii="Calibri" w:eastAsia="MS Mincho" w:hAnsi="Calibri" w:cs="Calibri"/>
+          <w:sz w:val="22"/>
+          <w:szCs w:val="22"/>
+        </w:rPr>
         <w:t>{{temperatura_ensayo_linea}}</w:t>
-      </w:r>
-    </w:p>
-    <w:p>
-      <w:pPr>
-        <w:pStyle w:val="Textosinformato"/>
-        <w:spacing w:line="276" w:lineRule="auto" w:after="0"/>
-        <w:ind w:left="792"/>
-        <w:rPr>
-          <w:rFonts w:ascii="Calibri" w:eastAsia="MS Mincho" w:hAnsi="Calibri" w:cs="Calibri"/>
-          <w:sz w:val="22"/>
-          <w:szCs w:val="22"/>
-        </w:rPr>
-      </w:pPr>
-      <w:r>
-        <w:rPr>
-          <w:rFonts w:ascii="Calibri" w:hAnsi="Calibri" w:cs="Calibri"/>
-          <w:sz w:val="22"/>
-          <w:szCs w:val="22"/>
-        </w:rPr>
-        <w:t>{{zona_plegado_linea}}</w:t>
       </w:r>
     </w:p>
     <w:p/>
@@ -585,7 +588,7 @@
           <w:ilvl w:val="1"/>
           <w:numId w:val="16"/>
         </w:numPr>
-        <w:spacing w:line="276" w:lineRule="auto" w:after="0"/>
+        <w:spacing w:line="276" w:lineRule="auto"/>
         <w:rPr>
           <w:rFonts w:ascii="Calibri" w:eastAsia="MS Mincho" w:hAnsi="Calibri"/>
           <w:b/>
@@ -606,7 +609,7 @@
     <w:p>
       <w:pPr>
         <w:pStyle w:val="Textosinformato"/>
-        <w:spacing w:line="276" w:lineRule="auto" w:after="0"/>
+        <w:spacing w:line="276" w:lineRule="auto"/>
         <w:ind w:left="792"/>
         <w:rPr>
           <w:rFonts w:ascii="Calibri" w:eastAsia="MS Mincho" w:hAnsi="Calibri"/>
@@ -626,7 +629,7 @@
     <w:p>
       <w:pPr>
         <w:pStyle w:val="Textosinformato"/>
-        <w:spacing w:line="276" w:lineRule="auto" w:after="0"/>
+        <w:spacing w:line="276" w:lineRule="auto"/>
         <w:ind w:left="792"/>
         <w:rPr>
           <w:rFonts w:ascii="Calibri" w:eastAsia="MS Mincho" w:hAnsi="Calibri"/>
@@ -646,7 +649,7 @@
     <w:p>
       <w:pPr>
         <w:pStyle w:val="Textosinformato"/>
-        <w:spacing w:line="276" w:lineRule="auto" w:after="0"/>
+        <w:spacing w:line="276" w:lineRule="auto"/>
         <w:ind w:left="792"/>
         <w:rPr>
           <w:rFonts w:ascii="Calibri" w:eastAsia="MS Mincho" w:hAnsi="Calibri"/>
@@ -666,7 +669,7 @@
     <w:p>
       <w:pPr>
         <w:pStyle w:val="Textosinformato"/>
-        <w:spacing w:line="276" w:lineRule="auto" w:after="0"/>
+        <w:spacing w:line="276" w:lineRule="auto"/>
         <w:ind w:left="792"/>
         <w:rPr>
           <w:rFonts w:ascii="Calibri" w:eastAsia="MS Mincho" w:hAnsi="Calibri"/>
@@ -686,7 +689,7 @@
     <w:p>
       <w:pPr>
         <w:pStyle w:val="Textosinformato"/>
-        <w:spacing w:line="276" w:lineRule="auto" w:after="0"/>
+        <w:spacing w:line="276" w:lineRule="auto"/>
         <w:ind w:left="792"/>
         <w:rPr>
           <w:rFonts w:ascii="Calibri" w:eastAsia="MS Mincho" w:hAnsi="Calibri"/>
@@ -706,7 +709,7 @@
     <w:p>
       <w:pPr>
         <w:pStyle w:val="Textosinformato"/>
-        <w:spacing w:line="276" w:lineRule="auto" w:after="0"/>
+        <w:spacing w:line="276" w:lineRule="auto"/>
         <w:rPr>
           <w:rFonts w:ascii="Calibri" w:eastAsia="MS Mincho" w:hAnsi="Calibri"/>
           <w:sz w:val="22"/>
@@ -721,7 +724,7 @@
           <w:ilvl w:val="1"/>
           <w:numId w:val="16"/>
         </w:numPr>
-        <w:spacing w:line="276" w:lineRule="auto" w:after="0"/>
+        <w:spacing w:line="276" w:lineRule="auto"/>
         <w:rPr>
           <w:rFonts w:ascii="Calibri" w:eastAsia="MS Mincho" w:hAnsi="Calibri"/>
           <w:b/>
@@ -742,7 +745,7 @@
     <w:p>
       <w:pPr>
         <w:pStyle w:val="Textosinformato"/>
-        <w:spacing w:line="276" w:lineRule="auto" w:after="0"/>
+        <w:spacing w:line="276" w:lineRule="auto"/>
         <w:ind w:left="851"/>
         <w:rPr>
           <w:rFonts w:ascii="Calibri" w:eastAsia="MS Mincho" w:hAnsi="Calibri"/>
@@ -780,7 +783,7 @@
     <w:p>
       <w:pPr>
         <w:pStyle w:val="Textosinformato"/>
-        <w:spacing w:line="276" w:lineRule="auto" w:after="0"/>
+        <w:spacing w:line="276" w:lineRule="auto"/>
         <w:ind w:left="851"/>
         <w:rPr>
           <w:rFonts w:ascii="Calibri" w:eastAsia="MS Mincho" w:hAnsi="Calibri" w:cs="Calibri"/>
@@ -824,7 +827,7 @@
           <w:p>
             <w:pPr>
               <w:pStyle w:val="Textosinformato"/>
-              <w:spacing w:line="276" w:lineRule="auto" w:after="0"/>
+              <w:spacing w:line="276" w:lineRule="auto"/>
               <w:jc w:val="center"/>
               <w:rPr>
                 <w:rFonts w:ascii="Calibri" w:eastAsia="MS Mincho" w:hAnsi="Calibri" w:cs="Courier New"/>
@@ -853,7 +856,7 @@
           <w:p>
             <w:pPr>
               <w:pStyle w:val="Textosinformato"/>
-              <w:spacing w:line="276" w:lineRule="auto" w:after="0"/>
+              <w:spacing w:line="276" w:lineRule="auto"/>
               <w:jc w:val="center"/>
               <w:rPr>
                 <w:rFonts w:ascii="Calibri" w:eastAsia="MS Mincho" w:hAnsi="Calibri" w:cs="Courier New"/>
@@ -882,7 +885,7 @@
           <w:p>
             <w:pPr>
               <w:pStyle w:val="Textosinformato"/>
-              <w:spacing w:line="276" w:lineRule="auto" w:after="0"/>
+              <w:spacing w:line="276" w:lineRule="auto"/>
               <w:jc w:val="center"/>
               <w:rPr>
                 <w:rFonts w:ascii="Calibri" w:eastAsia="MS Mincho" w:hAnsi="Calibri" w:cs="Courier New"/>
@@ -914,7 +917,7 @@
           <w:p>
             <w:pPr>
               <w:pStyle w:val="Textosinformato"/>
-              <w:spacing w:line="276" w:lineRule="auto" w:after="0"/>
+              <w:spacing w:line="276" w:lineRule="auto"/>
               <w:jc w:val="center"/>
               <w:rPr>
                 <w:rFonts w:ascii="Calibri" w:eastAsia="MS Mincho" w:hAnsi="Calibri" w:cs="Courier New"/>
@@ -941,7 +944,7 @@
           <w:p>
             <w:pPr>
               <w:pStyle w:val="Textosinformato"/>
-              <w:spacing w:line="276" w:lineRule="auto" w:after="0"/>
+              <w:spacing w:line="276" w:lineRule="auto"/>
               <w:jc w:val="center"/>
               <w:rPr>
                 <w:rFonts w:ascii="Calibri" w:eastAsia="MS Mincho" w:hAnsi="Calibri" w:cs="Courier New"/>
@@ -966,7 +969,7 @@
           <w:p>
             <w:pPr>
               <w:pStyle w:val="Textosinformato"/>
-              <w:spacing w:line="276" w:lineRule="auto" w:after="0"/>
+              <w:spacing w:line="276" w:lineRule="auto"/>
               <w:jc w:val="center"/>
               <w:rPr>
                 <w:rFonts w:ascii="Calibri" w:eastAsia="MS Mincho" w:hAnsi="Calibri" w:cs="Courier New"/>
@@ -996,7 +999,7 @@
           <w:p>
             <w:pPr>
               <w:pStyle w:val="Textosinformato"/>
-              <w:spacing w:line="276" w:lineRule="auto" w:after="0"/>
+              <w:spacing w:line="276" w:lineRule="auto"/>
               <w:jc w:val="center"/>
               <w:rPr>
                 <w:rFonts w:ascii="Calibri" w:eastAsia="MS Mincho" w:hAnsi="Calibri" w:cs="Courier New"/>
@@ -1023,7 +1026,7 @@
           <w:p>
             <w:pPr>
               <w:pStyle w:val="Textosinformato"/>
-              <w:spacing w:line="276" w:lineRule="auto" w:after="0"/>
+              <w:spacing w:line="276" w:lineRule="auto"/>
               <w:jc w:val="center"/>
               <w:rPr>
                 <w:rFonts w:ascii="Calibri" w:eastAsia="MS Mincho" w:hAnsi="Calibri" w:cs="Courier New"/>
@@ -1040,7 +1043,7 @@
           <w:p>
             <w:pPr>
               <w:pStyle w:val="Textosinformato"/>
-              <w:spacing w:line="276" w:lineRule="auto" w:after="0"/>
+              <w:spacing w:line="276" w:lineRule="auto"/>
               <w:jc w:val="center"/>
               <w:rPr>
                 <w:rFonts w:ascii="Calibri" w:eastAsia="MS Mincho" w:hAnsi="Calibri" w:cs="Courier New"/>
@@ -1070,7 +1073,7 @@
           <w:p>
             <w:pPr>
               <w:pStyle w:val="Textosinformato"/>
-              <w:spacing w:line="276" w:lineRule="auto" w:after="0"/>
+              <w:spacing w:line="276" w:lineRule="auto"/>
               <w:jc w:val="center"/>
               <w:rPr>
                 <w:rFonts w:ascii="Calibri" w:eastAsia="MS Mincho" w:hAnsi="Calibri" w:cs="Courier New"/>
@@ -1097,7 +1100,7 @@
           <w:p>
             <w:pPr>
               <w:pStyle w:val="Textosinformato"/>
-              <w:spacing w:line="276" w:lineRule="auto" w:after="0"/>
+              <w:spacing w:line="276" w:lineRule="auto"/>
               <w:jc w:val="center"/>
               <w:rPr>
                 <w:rFonts w:ascii="Calibri" w:eastAsia="MS Mincho" w:hAnsi="Calibri" w:cs="Courier New"/>
@@ -1122,7 +1125,7 @@
           <w:p>
             <w:pPr>
               <w:pStyle w:val="Textosinformato"/>
-              <w:spacing w:line="276" w:lineRule="auto" w:after="0"/>
+              <w:spacing w:line="276" w:lineRule="auto"/>
               <w:jc w:val="center"/>
               <w:rPr>
                 <w:rFonts w:ascii="Calibri" w:eastAsia="MS Mincho" w:hAnsi="Calibri" w:cs="Courier New"/>
@@ -1152,7 +1155,7 @@
           <w:p>
             <w:pPr>
               <w:pStyle w:val="Textosinformato"/>
-              <w:spacing w:line="276" w:lineRule="auto" w:after="0"/>
+              <w:spacing w:line="276" w:lineRule="auto"/>
               <w:jc w:val="center"/>
               <w:rPr>
                 <w:rFonts w:ascii="Calibri" w:eastAsia="MS Mincho" w:hAnsi="Calibri" w:cs="Courier New"/>
@@ -1178,7 +1181,7 @@
           <w:p>
             <w:pPr>
               <w:pStyle w:val="Textosinformato"/>
-              <w:spacing w:line="276" w:lineRule="auto" w:after="0"/>
+              <w:spacing w:line="276" w:lineRule="auto"/>
               <w:rPr>
                 <w:rFonts w:ascii="Calibri" w:eastAsia="MS Mincho" w:hAnsi="Calibri" w:cs="Courier New"/>
                 <w:sz w:val="22"/>
@@ -1194,7 +1197,7 @@
           <w:p>
             <w:pPr>
               <w:pStyle w:val="Textosinformato"/>
-              <w:spacing w:line="276" w:lineRule="auto" w:after="0"/>
+              <w:spacing w:line="276" w:lineRule="auto"/>
               <w:jc w:val="center"/>
               <w:rPr>
                 <w:rFonts w:ascii="Calibri" w:eastAsia="MS Mincho" w:hAnsi="Calibri" w:cs="Courier New"/>
@@ -1217,7 +1220,7 @@
     <w:p>
       <w:pPr>
         <w:pStyle w:val="Textosinformato"/>
-        <w:spacing w:line="276" w:lineRule="auto" w:after="0"/>
+        <w:spacing w:line="276" w:lineRule="auto"/>
         <w:jc w:val="center"/>
         <w:rPr>
           <w:rFonts w:ascii="Calibri" w:eastAsia="MS Mincho" w:hAnsi="Calibri" w:cs="Calibri"/>
@@ -1271,7 +1274,7 @@
     <w:p>
       <w:pPr>
         <w:pStyle w:val="Textosinformato"/>
-        <w:spacing w:line="276" w:lineRule="auto" w:after="0"/>
+        <w:spacing w:line="276" w:lineRule="auto"/>
         <w:jc w:val="center"/>
         <w:rPr>
           <w:rFonts w:ascii="Calibri" w:eastAsia="MS Mincho" w:hAnsi="Calibri" w:cs="Calibri"/>
@@ -1315,6 +1318,7 @@
           <w:p>
             <w:pPr>
               <w:pStyle w:val="Textosinformato"/>
+              <w:spacing w:line="276" w:lineRule="auto"/>
               <w:jc w:val="center"/>
               <w:rPr>
                 <w:rFonts w:ascii="Calibri" w:eastAsia="MS Mincho" w:hAnsi="Calibri" w:cs="Courier New"/>
@@ -1322,7 +1326,6 @@
                 <w:sz w:val="22"/>
                 <w:szCs w:val="22"/>
               </w:rPr>
-              <w:spacing w:line="276" w:lineRule="auto" w:after="0"/>
             </w:pPr>
             <w:r>
               <w:rPr>
@@ -1344,6 +1347,7 @@
           <w:p>
             <w:pPr>
               <w:pStyle w:val="Textosinformato"/>
+              <w:spacing w:line="276" w:lineRule="auto"/>
               <w:jc w:val="center"/>
               <w:rPr>
                 <w:rFonts w:ascii="Calibri" w:eastAsia="MS Mincho" w:hAnsi="Calibri" w:cs="Courier New"/>
@@ -1351,7 +1355,6 @@
                 <w:sz w:val="22"/>
                 <w:szCs w:val="22"/>
               </w:rPr>
-              <w:spacing w:line="276" w:lineRule="auto" w:after="0"/>
             </w:pPr>
             <w:r>
               <w:rPr>
@@ -1373,6 +1376,7 @@
           <w:p>
             <w:pPr>
               <w:pStyle w:val="Textosinformato"/>
+              <w:spacing w:line="276" w:lineRule="auto"/>
               <w:jc w:val="center"/>
               <w:rPr>
                 <w:rFonts w:ascii="Calibri" w:eastAsia="MS Mincho" w:hAnsi="Calibri" w:cs="Courier New"/>
@@ -1380,7 +1384,6 @@
                 <w:sz w:val="22"/>
                 <w:szCs w:val="22"/>
               </w:rPr>
-              <w:spacing w:line="276" w:lineRule="auto" w:after="0"/>
             </w:pPr>
             <w:r>
               <w:rPr>
@@ -1405,13 +1408,13 @@
           <w:p>
             <w:pPr>
               <w:pStyle w:val="Textosinformato"/>
+              <w:spacing w:line="276" w:lineRule="auto"/>
               <w:jc w:val="center"/>
               <w:rPr>
                 <w:rFonts w:ascii="Calibri" w:eastAsia="MS Mincho" w:hAnsi="Calibri" w:cs="Courier New"/>
                 <w:sz w:val="22"/>
                 <w:szCs w:val="22"/>
               </w:rPr>
-              <w:spacing w:line="276" w:lineRule="auto" w:after="0"/>
             </w:pPr>
             <w:r>
               <w:rPr>
@@ -1419,6 +1422,7 @@
                 <w:sz w:val="22"/>
                 <w:szCs w:val="22"/>
               </w:rPr>
+              <w:lastRenderedPageBreak/>
               <w:t>PL 1</w:t>
             </w:r>
           </w:p>
@@ -1432,13 +1436,13 @@
           <w:p>
             <w:pPr>
               <w:pStyle w:val="Textosinformato"/>
+              <w:spacing w:line="276" w:lineRule="auto"/>
               <w:jc w:val="center"/>
               <w:rPr>
                 <w:rFonts w:ascii="Calibri" w:eastAsia="MS Mincho" w:hAnsi="Calibri" w:cs="Courier New"/>
                 <w:sz w:val="22"/>
                 <w:szCs w:val="22"/>
               </w:rPr>
-              <w:spacing w:line="276" w:lineRule="auto" w:after="0"/>
             </w:pPr>
             <w:r>
               <w:rPr>
@@ -1457,13 +1461,13 @@
           <w:p>
             <w:pPr>
               <w:pStyle w:val="Textosinformato"/>
+              <w:spacing w:line="276" w:lineRule="auto"/>
               <w:jc w:val="center"/>
               <w:rPr>
                 <w:rFonts w:ascii="Calibri" w:eastAsia="MS Mincho" w:hAnsi="Calibri" w:cs="Courier New"/>
                 <w:sz w:val="22"/>
                 <w:szCs w:val="22"/>
               </w:rPr>
-              <w:spacing w:line="276" w:lineRule="auto" w:after="0"/>
             </w:pPr>
             <w:r>
               <w:rPr>
@@ -1487,13 +1491,13 @@
           <w:p>
             <w:pPr>
               <w:pStyle w:val="Textosinformato"/>
+              <w:spacing w:line="276" w:lineRule="auto"/>
               <w:jc w:val="center"/>
               <w:rPr>
                 <w:rFonts w:ascii="Calibri" w:eastAsia="MS Mincho" w:hAnsi="Calibri" w:cs="Courier New"/>
                 <w:sz w:val="22"/>
                 <w:szCs w:val="22"/>
               </w:rPr>
-              <w:spacing w:line="276" w:lineRule="auto" w:after="0"/>
             </w:pPr>
             <w:r>
               <w:rPr>
@@ -1501,7 +1505,6 @@
                 <w:sz w:val="22"/>
                 <w:szCs w:val="22"/>
               </w:rPr>
-              <w:lastRenderedPageBreak/>
               <w:t>PL 2</w:t>
             </w:r>
           </w:p>
@@ -1514,13 +1517,13 @@
           <w:p>
             <w:pPr>
               <w:pStyle w:val="Textosinformato"/>
+              <w:spacing w:line="276" w:lineRule="auto"/>
               <w:jc w:val="center"/>
               <w:rPr>
                 <w:rFonts w:ascii="Calibri" w:eastAsia="MS Mincho" w:hAnsi="Calibri" w:cs="Courier New"/>
                 <w:sz w:val="22"/>
                 <w:szCs w:val="22"/>
               </w:rPr>
-              <w:spacing w:line="276" w:lineRule="auto" w:after="0"/>
             </w:pPr>
           </w:p>
         </w:tc>
@@ -1531,13 +1534,13 @@
           <w:p>
             <w:pPr>
               <w:pStyle w:val="Textosinformato"/>
+              <w:spacing w:line="276" w:lineRule="auto"/>
               <w:jc w:val="center"/>
               <w:rPr>
                 <w:rFonts w:ascii="Calibri" w:eastAsia="MS Mincho" w:hAnsi="Calibri" w:cs="Courier New"/>
                 <w:sz w:val="22"/>
                 <w:szCs w:val="22"/>
               </w:rPr>
-              <w:spacing w:line="276" w:lineRule="auto" w:after="0"/>
             </w:pPr>
             <w:r>
               <w:rPr>
@@ -1561,13 +1564,13 @@
           <w:p>
             <w:pPr>
               <w:pStyle w:val="Textosinformato"/>
+              <w:spacing w:line="276" w:lineRule="auto"/>
               <w:jc w:val="center"/>
               <w:rPr>
                 <w:rFonts w:ascii="Calibri" w:eastAsia="MS Mincho" w:hAnsi="Calibri" w:cs="Courier New"/>
                 <w:sz w:val="22"/>
                 <w:szCs w:val="22"/>
               </w:rPr>
-              <w:spacing w:line="276" w:lineRule="auto" w:after="0"/>
             </w:pPr>
             <w:r>
               <w:rPr>
@@ -1587,13 +1590,13 @@
           <w:p>
             <w:pPr>
               <w:pStyle w:val="Textosinformato"/>
+              <w:spacing w:line="276" w:lineRule="auto"/>
               <w:jc w:val="center"/>
               <w:rPr>
                 <w:rFonts w:ascii="Calibri" w:eastAsia="MS Mincho" w:hAnsi="Calibri" w:cs="Courier New"/>
                 <w:sz w:val="22"/>
                 <w:szCs w:val="22"/>
               </w:rPr>
-              <w:spacing w:line="276" w:lineRule="auto" w:after="0"/>
             </w:pPr>
           </w:p>
         </w:tc>
@@ -1604,13 +1607,13 @@
           <w:p>
             <w:pPr>
               <w:pStyle w:val="Textosinformato"/>
+              <w:spacing w:line="276" w:lineRule="auto"/>
               <w:jc w:val="center"/>
               <w:rPr>
                 <w:rFonts w:ascii="Calibri" w:eastAsia="MS Mincho" w:hAnsi="Calibri" w:cs="Courier New"/>
                 <w:sz w:val="22"/>
                 <w:szCs w:val="22"/>
               </w:rPr>
-              <w:spacing w:line="276" w:lineRule="auto" w:after="0"/>
             </w:pPr>
             <w:r>
               <w:rPr>
@@ -1634,13 +1637,13 @@
           <w:p>
             <w:pPr>
               <w:pStyle w:val="Textosinformato"/>
+              <w:spacing w:line="276" w:lineRule="auto"/>
               <w:jc w:val="center"/>
               <w:rPr>
                 <w:rFonts w:ascii="Calibri" w:eastAsia="MS Mincho" w:hAnsi="Calibri" w:cs="Courier New"/>
                 <w:sz w:val="22"/>
                 <w:szCs w:val="22"/>
               </w:rPr>
-              <w:spacing w:line="276" w:lineRule="auto" w:after="0"/>
             </w:pPr>
             <w:r>
               <w:rPr>
@@ -1660,12 +1663,12 @@
           <w:p>
             <w:pPr>
               <w:pStyle w:val="Textosinformato"/>
-              <w:rPr>
-                <w:rFonts w:ascii="Calibri" w:eastAsia="MS Mincho" w:hAnsi="Calibri" w:cs="Courier New"/>
-                <w:sz w:val="22"/>
-                <w:szCs w:val="22"/>
-              </w:rPr>
-              <w:spacing w:line="276" w:lineRule="auto" w:after="0"/>
+              <w:spacing w:line="276" w:lineRule="auto"/>
+              <w:rPr>
+                <w:rFonts w:ascii="Calibri" w:eastAsia="MS Mincho" w:hAnsi="Calibri" w:cs="Courier New"/>
+                <w:sz w:val="22"/>
+                <w:szCs w:val="22"/>
+              </w:rPr>
             </w:pPr>
           </w:p>
         </w:tc>
@@ -1676,13 +1679,13 @@
           <w:p>
             <w:pPr>
               <w:pStyle w:val="Textosinformato"/>
+              <w:spacing w:line="276" w:lineRule="auto"/>
               <w:jc w:val="center"/>
               <w:rPr>
                 <w:rFonts w:ascii="Calibri" w:eastAsia="MS Mincho" w:hAnsi="Calibri" w:cs="Courier New"/>
                 <w:sz w:val="22"/>
                 <w:szCs w:val="22"/>
               </w:rPr>
-              <w:spacing w:line="276" w:lineRule="auto" w:after="0"/>
             </w:pPr>
             <w:r>
               <w:rPr>
@@ -1699,7 +1702,7 @@
     <w:p>
       <w:pPr>
         <w:pStyle w:val="Textosinformato"/>
-        <w:spacing w:line="276" w:lineRule="auto" w:after="0"/>
+        <w:spacing w:line="276" w:lineRule="auto"/>
         <w:jc w:val="center"/>
         <w:rPr>
           <w:rFonts w:ascii="Calibri" w:eastAsia="MS Mincho" w:hAnsi="Calibri" w:cs="Calibri"/>
@@ -1763,7 +1766,7 @@
     <w:p>
       <w:pPr>
         <w:pStyle w:val="Textosinformato"/>
-        <w:spacing w:line="276" w:lineRule="auto" w:after="0"/>
+        <w:spacing w:line="276" w:lineRule="auto"/>
         <w:jc w:val="center"/>
         <w:rPr>
           <w:rFonts w:ascii="Calibri" w:eastAsia="MS Mincho" w:hAnsi="Calibri" w:cs="Calibri"/>
@@ -1807,7 +1810,7 @@
           <w:p>
             <w:pPr>
               <w:pStyle w:val="Textosinformato"/>
-              <w:spacing w:line="276" w:lineRule="auto" w:after="0"/>
+              <w:spacing w:line="276" w:lineRule="auto"/>
               <w:jc w:val="center"/>
               <w:rPr>
                 <w:rFonts w:ascii="Calibri" w:eastAsia="MS Mincho" w:hAnsi="Calibri" w:cs="Courier New"/>
@@ -1836,7 +1839,7 @@
           <w:p>
             <w:pPr>
               <w:pStyle w:val="Textosinformato"/>
-              <w:spacing w:line="276" w:lineRule="auto" w:after="0"/>
+              <w:spacing w:line="276" w:lineRule="auto"/>
               <w:jc w:val="center"/>
               <w:rPr>
                 <w:rFonts w:ascii="Calibri" w:eastAsia="MS Mincho" w:hAnsi="Calibri" w:cs="Courier New"/>
@@ -1865,7 +1868,7 @@
           <w:p>
             <w:pPr>
               <w:pStyle w:val="Textosinformato"/>
-              <w:spacing w:line="276" w:lineRule="auto" w:after="0"/>
+              <w:spacing w:line="276" w:lineRule="auto"/>
               <w:jc w:val="center"/>
               <w:rPr>
                 <w:rFonts w:ascii="Calibri" w:eastAsia="MS Mincho" w:hAnsi="Calibri" w:cs="Courier New"/>
@@ -1897,7 +1900,7 @@
           <w:p>
             <w:pPr>
               <w:pStyle w:val="Textosinformato"/>
-              <w:spacing w:line="276" w:lineRule="auto" w:after="0"/>
+              <w:spacing w:line="276" w:lineRule="auto"/>
               <w:jc w:val="center"/>
               <w:rPr>
                 <w:rFonts w:ascii="Calibri" w:eastAsia="MS Mincho" w:hAnsi="Calibri" w:cs="Courier New"/>
@@ -1914,7 +1917,7 @@
           <w:p>
             <w:pPr>
               <w:pStyle w:val="Textosinformato"/>
-              <w:spacing w:line="276" w:lineRule="auto" w:after="0"/>
+              <w:spacing w:line="276" w:lineRule="auto"/>
               <w:jc w:val="center"/>
               <w:rPr>
                 <w:rFonts w:ascii="Calibri" w:eastAsia="MS Mincho" w:hAnsi="Calibri" w:cs="Courier New"/>
@@ -1931,7 +1934,7 @@
           <w:p>
             <w:pPr>
               <w:pStyle w:val="Textosinformato"/>
-              <w:spacing w:line="276" w:lineRule="auto" w:after="0"/>
+              <w:spacing w:line="276" w:lineRule="auto"/>
               <w:jc w:val="center"/>
               <w:rPr>
                 <w:rFonts w:ascii="Calibri" w:eastAsia="MS Mincho" w:hAnsi="Calibri" w:cs="Courier New"/>
@@ -1961,7 +1964,7 @@
           <w:p>
             <w:pPr>
               <w:pStyle w:val="Textosinformato"/>
-              <w:spacing w:line="276" w:lineRule="auto" w:after="0"/>
+              <w:spacing w:line="276" w:lineRule="auto"/>
               <w:jc w:val="center"/>
               <w:rPr>
                 <w:rFonts w:ascii="Calibri" w:eastAsia="MS Mincho" w:hAnsi="Calibri" w:cs="Courier New"/>
@@ -1978,7 +1981,7 @@
           <w:p>
             <w:pPr>
               <w:pStyle w:val="Textosinformato"/>
-              <w:spacing w:line="276" w:lineRule="auto" w:after="0"/>
+              <w:spacing w:line="276" w:lineRule="auto"/>
               <w:jc w:val="center"/>
               <w:rPr>
                 <w:rFonts w:ascii="Calibri" w:eastAsia="MS Mincho" w:hAnsi="Calibri" w:cs="Courier New"/>
@@ -1995,7 +1998,7 @@
           <w:p>
             <w:pPr>
               <w:pStyle w:val="Textosinformato"/>
-              <w:spacing w:line="276" w:lineRule="auto" w:after="0"/>
+              <w:spacing w:line="276" w:lineRule="auto"/>
               <w:jc w:val="center"/>
               <w:rPr>
                 <w:rFonts w:ascii="Calibri" w:eastAsia="MS Mincho" w:hAnsi="Calibri" w:cs="Courier New"/>
@@ -2025,7 +2028,7 @@
           <w:p>
             <w:pPr>
               <w:pStyle w:val="Textosinformato"/>
-              <w:spacing w:line="276" w:lineRule="auto" w:after="0"/>
+              <w:spacing w:line="276" w:lineRule="auto"/>
               <w:jc w:val="center"/>
               <w:rPr>
                 <w:rFonts w:ascii="Calibri" w:eastAsia="MS Mincho" w:hAnsi="Calibri" w:cs="Courier New"/>
@@ -2042,7 +2045,7 @@
           <w:p>
             <w:pPr>
               <w:pStyle w:val="Textosinformato"/>
-              <w:spacing w:line="276" w:lineRule="auto" w:after="0"/>
+              <w:spacing w:line="276" w:lineRule="auto"/>
               <w:jc w:val="center"/>
               <w:rPr>
                 <w:rFonts w:ascii="Calibri" w:eastAsia="MS Mincho" w:hAnsi="Calibri" w:cs="Courier New"/>
@@ -2059,7 +2062,7 @@
           <w:p>
             <w:pPr>
               <w:pStyle w:val="Textosinformato"/>
-              <w:spacing w:line="276" w:lineRule="auto" w:after="0"/>
+              <w:spacing w:line="276" w:lineRule="auto"/>
               <w:jc w:val="center"/>
               <w:rPr>
                 <w:rFonts w:ascii="Calibri" w:eastAsia="MS Mincho" w:hAnsi="Calibri" w:cs="Courier New"/>
@@ -2089,7 +2092,7 @@
           <w:p>
             <w:pPr>
               <w:pStyle w:val="Textosinformato"/>
-              <w:spacing w:line="276" w:lineRule="auto" w:after="0"/>
+              <w:spacing w:line="276" w:lineRule="auto"/>
               <w:jc w:val="center"/>
               <w:rPr>
                 <w:rFonts w:ascii="Calibri" w:eastAsia="MS Mincho" w:hAnsi="Calibri" w:cs="Courier New"/>
@@ -2106,7 +2109,7 @@
           <w:p>
             <w:pPr>
               <w:pStyle w:val="Textosinformato"/>
-              <w:spacing w:line="276" w:lineRule="auto" w:after="0"/>
+              <w:spacing w:line="276" w:lineRule="auto"/>
               <w:rPr>
                 <w:rFonts w:ascii="Calibri" w:eastAsia="MS Mincho" w:hAnsi="Calibri" w:cs="Courier New"/>
                 <w:sz w:val="22"/>
@@ -2122,7 +2125,7 @@
           <w:p>
             <w:pPr>
               <w:pStyle w:val="Textosinformato"/>
-              <w:spacing w:line="276" w:lineRule="auto" w:after="0"/>
+              <w:spacing w:line="276" w:lineRule="auto"/>
               <w:jc w:val="center"/>
               <w:rPr>
                 <w:rFonts w:ascii="Calibri" w:eastAsia="MS Mincho" w:hAnsi="Calibri" w:cs="Courier New"/>
@@ -2145,7 +2148,7 @@
     <w:p>
       <w:pPr>
         <w:pStyle w:val="Textosinformato"/>
-        <w:spacing w:line="276" w:lineRule="auto" w:after="0"/>
+        <w:spacing w:line="276" w:lineRule="auto"/>
         <w:jc w:val="center"/>
         <w:rPr>
           <w:rFonts w:ascii="Calibri" w:eastAsia="MS Mincho" w:hAnsi="Calibri" w:cs="Calibri"/>
@@ -2184,7 +2187,7 @@
           <w:tab w:val="left" w:pos="709"/>
           <w:tab w:val="left" w:pos="851"/>
         </w:tabs>
-        <w:spacing w:line="276" w:lineRule="auto" w:after="0"/>
+        <w:spacing w:line="276" w:lineRule="auto"/>
         <w:rPr>
           <w:rFonts w:ascii="Calibri" w:eastAsia="MS Mincho" w:hAnsi="Calibri" w:cs="Calibri"/>
           <w:i/>
@@ -2206,7 +2209,7 @@
           <w:tab w:val="left" w:pos="709"/>
           <w:tab w:val="left" w:pos="851"/>
         </w:tabs>
-        <w:spacing w:line="276" w:lineRule="auto" w:after="0"/>
+        <w:spacing w:line="276" w:lineRule="auto"/>
         <w:rPr>
           <w:rFonts w:ascii="Calibri" w:eastAsia="MS Mincho" w:hAnsi="Calibri"/>
           <w:b/>
@@ -2232,7 +2235,7 @@
           <w:tab w:val="left" w:pos="709"/>
           <w:tab w:val="left" w:pos="851"/>
         </w:tabs>
-        <w:spacing w:line="276" w:lineRule="auto" w:after="0"/>
+        <w:spacing w:line="276" w:lineRule="auto"/>
         <w:rPr>
           <w:rFonts w:ascii="Calibri" w:eastAsia="MS Mincho" w:hAnsi="Calibri" w:cs="Calibri"/>
           <w:b/>
@@ -2268,13 +2271,13 @@
     <w:p>
       <w:pPr>
         <w:pStyle w:val="Textosinformato"/>
+        <w:spacing w:line="276" w:lineRule="auto"/>
         <w:rPr>
           <w:rFonts w:ascii="Calibri" w:eastAsia="MS Mincho" w:hAnsi="Calibri" w:cs="Calibri"/>
           <w:b/>
           <w:sz w:val="22"/>
           <w:szCs w:val="22"/>
         </w:rPr>
-        <w:spacing w:line="276" w:lineRule="auto" w:after="0"/>
       </w:pPr>
     </w:p>
     <w:p>
@@ -2284,12 +2287,12 @@
           <w:ilvl w:val="1"/>
           <w:numId w:val="16"/>
         </w:numPr>
+        <w:spacing w:line="276" w:lineRule="auto"/>
         <w:rPr>
           <w:rFonts w:ascii="Calibri" w:hAnsi="Calibri" w:cs="Calibri"/>
           <w:sz w:val="22"/>
           <w:szCs w:val="22"/>
         </w:rPr>
-        <w:spacing w:line="276" w:lineRule="auto" w:after="0"/>
       </w:pPr>
       <w:r>
         <w:rPr>
@@ -2304,13 +2307,13 @@
     <w:p>
       <w:pPr>
         <w:pStyle w:val="Textosinformato"/>
+        <w:spacing w:line="276" w:lineRule="auto"/>
         <w:ind w:left="792"/>
         <w:rPr>
           <w:rFonts w:ascii="Calibri" w:eastAsia="MS Mincho" w:hAnsi="Calibri" w:cs="Calibri"/>
           <w:sz w:val="22"/>
           <w:szCs w:val="22"/>
         </w:rPr>
-        <w:spacing w:line="276" w:lineRule="auto" w:after="0"/>
       </w:pPr>
       <w:r>
         <w:rPr>
@@ -2323,12 +2326,12 @@
     </w:p>
     <w:p>
       <w:pPr>
+        <w:spacing w:line="276" w:lineRule="auto"/>
         <w:rPr>
           <w:rFonts w:ascii="Calibri" w:eastAsia="MS Mincho" w:hAnsi="Calibri" w:cs="Calibri"/>
           <w:sz w:val="22"/>
           <w:szCs w:val="22"/>
         </w:rPr>
-        <w:spacing w:line="276" w:lineRule="auto" w:after="0"/>
       </w:pPr>
     </w:p>
     <w:p>
@@ -2338,13 +2341,13 @@
           <w:ilvl w:val="1"/>
           <w:numId w:val="16"/>
         </w:numPr>
+        <w:spacing w:line="276" w:lineRule="auto"/>
         <w:rPr>
           <w:rFonts w:ascii="Calibri" w:eastAsia="MS Mincho" w:hAnsi="Calibri" w:cs="Calibri"/>
           <w:b/>
           <w:sz w:val="22"/>
           <w:szCs w:val="22"/>
         </w:rPr>
-        <w:spacing w:line="276" w:lineRule="auto" w:after="0"/>
       </w:pPr>
       <w:r>
         <w:rPr>
@@ -2368,7 +2371,7 @@
     <w:p>
       <w:pPr>
         <w:pStyle w:val="Textosinformato"/>
-        <w:spacing w:line="276" w:lineRule="auto" w:after="0"/>
+        <w:spacing w:line="276" w:lineRule="auto"/>
         <w:ind w:left="792"/>
         <w:rPr>
           <w:rFonts w:ascii="Calibri" w:eastAsia="MS Mincho" w:hAnsi="Calibri" w:cs="Calibri"/>
@@ -2404,7 +2407,7 @@
     <w:p>
       <w:pPr>
         <w:pStyle w:val="Textosinformato"/>
-        <w:spacing w:line="276" w:lineRule="auto" w:after="0"/>
+        <w:spacing w:line="276" w:lineRule="auto"/>
         <w:ind w:left="792"/>
         <w:rPr>
           <w:rFonts w:ascii="Calibri" w:eastAsia="MS Mincho" w:hAnsi="Calibri" w:cs="Calibri"/>
@@ -2424,7 +2427,7 @@
     <w:p>
       <w:pPr>
         <w:pStyle w:val="Textosinformato"/>
-        <w:spacing w:line="276" w:lineRule="auto" w:after="0"/>
+        <w:spacing w:line="276" w:lineRule="auto"/>
         <w:ind w:left="792"/>
         <w:rPr>
           <w:rFonts w:ascii="Calibri" w:eastAsia="MS Mincho" w:hAnsi="Calibri" w:cs="Calibri"/>
@@ -2444,7 +2447,7 @@
     <w:p>
       <w:pPr>
         <w:pStyle w:val="Textosinformato"/>
-        <w:spacing w:line="276" w:lineRule="auto" w:after="0"/>
+        <w:spacing w:line="276" w:lineRule="auto"/>
         <w:ind w:left="792"/>
         <w:rPr>
           <w:rFonts w:ascii="Calibri" w:eastAsia="MS Mincho" w:hAnsi="Calibri" w:cs="Calibri"/>
@@ -2463,16 +2466,17 @@
     </w:p>
     <w:p>
       <w:pPr>
+        <w:spacing w:line="276" w:lineRule="auto"/>
         <w:rPr>
           <w:rFonts w:ascii="Calibri" w:eastAsia="MS Mincho" w:hAnsi="Calibri" w:cs="Calibri"/>
           <w:sz w:val="22"/>
           <w:szCs w:val="22"/>
         </w:rPr>
-        <w:spacing w:line="276" w:lineRule="auto" w:after="0"/>
       </w:pPr>
     </w:p>
     <w:p>
       <w:pPr>
+        <w:spacing w:line="276" w:lineRule="auto"/>
         <w:jc w:val="center"/>
         <w:rPr>
           <w:rFonts w:ascii="Calibri Light" w:eastAsia="MS Mincho" w:hAnsi="Calibri Light" w:cs="Calibri Light"/>
@@ -2481,7 +2485,6 @@
           <w:sz w:val="22"/>
           <w:szCs w:val="22"/>
         </w:rPr>
-        <w:spacing w:line="276" w:lineRule="auto" w:after="0"/>
       </w:pPr>
       <w:r>
         <w:rPr>
@@ -2491,19 +2494,7 @@
           <w:sz w:val="22"/>
           <w:szCs w:val="22"/>
         </w:rPr>
-        <w:t>FIN DE</w:t>
-      </w:r>
-      <w:bookmarkStart w:id="1" w:name="_GoBack"/>
-      <w:bookmarkEnd w:id="1"/>
-      <w:r>
-        <w:rPr>
-          <w:rFonts w:ascii="Calibri Light" w:eastAsia="MS Mincho" w:hAnsi="Calibri Light" w:cs="Calibri Light"/>
-          <w:b/>
-          <w:bCs/>
-          <w:sz w:val="22"/>
-          <w:szCs w:val="22"/>
-        </w:rPr>
-        <w:t xml:space="preserve"> INFORME</w:t>
+        <w:t>FIN DE INFORME</w:t>
       </w:r>
     </w:p>
     <w:sectPr>

</xml_diff>